<commit_message>
Add Azure SSO setup to all guides (Markdown, Word, PowerPoint)
Co-authored-by: factory-droid[bot] <138933559+factory-droid[bot]@users.noreply.github.com>
</commit_message>
<xml_diff>
--- a/Factory_AI_Dashboard_Guide.docx
+++ b/Factory_AI_Dashboard_Guide.docx
@@ -776,6 +776,487 @@
       </w:pPr>
       <w:r>
         <w:t>Streamlit Cloud picks up the changes automatically</w:t>
+      </w:r>
+    </w:p>
+    <w:p>
+      <w:pPr>
+        <w:pStyle w:val="Heading1"/>
+      </w:pPr>
+      <w:r>
+        <w:t>Step 8: Secure Your Dashboard with Microsoft SSO</w:t>
+      </w:r>
+    </w:p>
+    <w:p>
+      <w:pPr>
+        <w:pStyle w:val="Heading3"/>
+      </w:pPr>
+      <w:r>
+        <w:t>Why This Matters</w:t>
+      </w:r>
+    </w:p>
+    <w:p>
+      <w:r>
+        <w:t>Without SSO, anyone can type any @ey.com email into the dashboard. There is no way to verify they are who they say they are. If your dashboard contains sensitive or confidential data, you must enable Microsoft SSO.</w:t>
+      </w:r>
+    </w:p>
+    <w:p>
+      <w:r>
+        <w:t>SSO forces users to sign in with their real EY Microsoft account — the same login they use for Outlook and Teams.</w:t>
+      </w:r>
+    </w:p>
+    <w:p>
+      <w:r>
+        <w:rPr>
+          <w:b/>
+          <w:color w:val="00A3E0"/>
+        </w:rPr>
+        <w:t xml:space="preserve">Tip: </w:t>
+      </w:r>
+      <w:r>
+        <w:t>The dashboard code already supports SSO. You do not need to change any code. You only need to register an app in Azure and paste three values into Streamlit Cloud. Once you do, SSO activates automatically.</w:t>
+      </w:r>
+    </w:p>
+    <w:p>
+      <w:pPr>
+        <w:pStyle w:val="Heading3"/>
+      </w:pPr>
+      <w:r>
+        <w:t>What You Need</w:t>
+      </w:r>
+    </w:p>
+    <w:p>
+      <w:r>
+        <w:t>You will need someone at EY with Azure AD admin (or Application Administrator) access. This is typically someone in your IT or Cloud Infrastructure team.</w:t>
+      </w:r>
+    </w:p>
+    <w:p>
+      <w:pPr>
+        <w:pStyle w:val="Heading3"/>
+      </w:pPr>
+      <w:r>
+        <w:t>8a. Register an App in Microsoft Entra ID</w:t>
+      </w:r>
+    </w:p>
+    <w:p>
+      <w:pPr>
+        <w:pStyle w:val="ListNumber"/>
+      </w:pPr>
+      <w:r>
+        <w:t>Go to portal.azure.com and sign in with your EY account</w:t>
+      </w:r>
+    </w:p>
+    <w:p>
+      <w:pPr>
+        <w:pStyle w:val="ListNumber"/>
+      </w:pPr>
+      <w:r>
+        <w:t>In the top search bar, type "App registrations" and click on it</w:t>
+      </w:r>
+    </w:p>
+    <w:p>
+      <w:pPr>
+        <w:pStyle w:val="ListNumber"/>
+      </w:pPr>
+      <w:r>
+        <w:t>Click "+ New registration"</w:t>
+      </w:r>
+    </w:p>
+    <w:p>
+      <w:pPr>
+        <w:pStyle w:val="ListNumber"/>
+      </w:pPr>
+      <w:r>
+        <w:t>Name: "Factory AI Dashboard"</w:t>
+      </w:r>
+    </w:p>
+    <w:p>
+      <w:pPr>
+        <w:pStyle w:val="ListNumber"/>
+      </w:pPr>
+      <w:r>
+        <w:t>Supported account types: "Accounts in this organizational directory only"</w:t>
+      </w:r>
+    </w:p>
+    <w:p>
+      <w:pPr>
+        <w:pStyle w:val="ListNumber"/>
+      </w:pPr>
+      <w:r>
+        <w:t>Redirect URI: Platform = Web, URI = your Streamlit Cloud URL</w:t>
+      </w:r>
+    </w:p>
+    <w:p>
+      <w:pPr>
+        <w:pStyle w:val="ListNumber"/>
+      </w:pPr>
+      <w:r>
+        <w:t>Click "Register"</w:t>
+      </w:r>
+    </w:p>
+    <w:p>
+      <w:pPr>
+        <w:pStyle w:val="Heading3"/>
+      </w:pPr>
+      <w:r>
+        <w:t>8b. Copy Your Two IDs</w:t>
+      </w:r>
+    </w:p>
+    <w:p>
+      <w:r>
+        <w:t>On the app's Overview page, copy and save:</w:t>
+      </w:r>
+    </w:p>
+    <w:p>
+      <w:pPr>
+        <w:pStyle w:val="ListBullet"/>
+      </w:pPr>
+      <w:r>
+        <w:t>Application (client) ID — save as client_id</w:t>
+      </w:r>
+    </w:p>
+    <w:p>
+      <w:pPr>
+        <w:pStyle w:val="ListBullet"/>
+      </w:pPr>
+      <w:r>
+        <w:t>Directory (tenant) ID — save as tenant_id</w:t>
+      </w:r>
+    </w:p>
+    <w:p>
+      <w:pPr>
+        <w:pStyle w:val="Heading3"/>
+      </w:pPr>
+      <w:r>
+        <w:t>8c. Create a Client Secret</w:t>
+      </w:r>
+    </w:p>
+    <w:p>
+      <w:pPr>
+        <w:pStyle w:val="ListNumber"/>
+      </w:pPr>
+      <w:r>
+        <w:t>In the left sidebar, click "Certificates &amp; secrets"</w:t>
+      </w:r>
+    </w:p>
+    <w:p>
+      <w:pPr>
+        <w:pStyle w:val="ListNumber"/>
+      </w:pPr>
+      <w:r>
+        <w:t>Click "+ New client secret"</w:t>
+      </w:r>
+    </w:p>
+    <w:p>
+      <w:pPr>
+        <w:pStyle w:val="ListNumber"/>
+      </w:pPr>
+      <w:r>
+        <w:t>Enter a description (e.g., "streamlit-dashboard")</w:t>
+      </w:r>
+    </w:p>
+    <w:p>
+      <w:pPr>
+        <w:pStyle w:val="ListNumber"/>
+      </w:pPr>
+      <w:r>
+        <w:t>Choose an expiry period (e.g., 12 months)</w:t>
+      </w:r>
+    </w:p>
+    <w:p>
+      <w:pPr>
+        <w:pStyle w:val="ListNumber"/>
+      </w:pPr>
+      <w:r>
+        <w:t>Click "Add"</w:t>
+      </w:r>
+    </w:p>
+    <w:p>
+      <w:pPr>
+        <w:pStyle w:val="ListNumber"/>
+      </w:pPr>
+      <w:r>
+        <w:t>Immediately copy the value in the "Value" column — this is your client_secret</w:t>
+      </w:r>
+    </w:p>
+    <w:p>
+      <w:r>
+        <w:rPr>
+          <w:b/>
+          <w:color w:val="00A3E0"/>
+        </w:rPr>
+        <w:t xml:space="preserve">Tip: </w:t>
+      </w:r>
+      <w:r>
+        <w:t>The secret value is only shown once. If you navigate away without copying it, you will need to create a new one.</w:t>
+      </w:r>
+    </w:p>
+    <w:p>
+      <w:pPr>
+        <w:pStyle w:val="Heading3"/>
+      </w:pPr>
+      <w:r>
+        <w:t>8d. Add API Permissions</w:t>
+      </w:r>
+    </w:p>
+    <w:p>
+      <w:pPr>
+        <w:pStyle w:val="ListNumber"/>
+      </w:pPr>
+      <w:r>
+        <w:t>In the left sidebar, click "API permissions"</w:t>
+      </w:r>
+    </w:p>
+    <w:p>
+      <w:pPr>
+        <w:pStyle w:val="ListNumber"/>
+      </w:pPr>
+      <w:r>
+        <w:t>Click "+ Add a permission"</w:t>
+      </w:r>
+    </w:p>
+    <w:p>
+      <w:pPr>
+        <w:pStyle w:val="ListNumber"/>
+      </w:pPr>
+      <w:r>
+        <w:t>Select "Microsoft Graph"</w:t>
+      </w:r>
+    </w:p>
+    <w:p>
+      <w:pPr>
+        <w:pStyle w:val="ListNumber"/>
+      </w:pPr>
+      <w:r>
+        <w:t>Select "Delegated permissions"</w:t>
+      </w:r>
+    </w:p>
+    <w:p>
+      <w:pPr>
+        <w:pStyle w:val="ListNumber"/>
+      </w:pPr>
+      <w:r>
+        <w:t>Search for "User.Read" and check the box</w:t>
+      </w:r>
+    </w:p>
+    <w:p>
+      <w:pPr>
+        <w:pStyle w:val="ListNumber"/>
+      </w:pPr>
+      <w:r>
+        <w:t>Click "Add permissions"</w:t>
+      </w:r>
+    </w:p>
+    <w:p>
+      <w:pPr>
+        <w:pStyle w:val="ListNumber"/>
+      </w:pPr>
+      <w:r>
+        <w:t>Click "Grant admin consent for EY"</w:t>
+      </w:r>
+    </w:p>
+    <w:p>
+      <w:r>
+        <w:t>If you do not see the "Grant admin consent" button, you need someone with a higher admin role to click it for you.</w:t>
+      </w:r>
+    </w:p>
+    <w:p>
+      <w:pPr>
+        <w:pStyle w:val="Heading3"/>
+      </w:pPr>
+      <w:r>
+        <w:t>8e. Add Your Three Values to Streamlit Cloud</w:t>
+      </w:r>
+    </w:p>
+    <w:p>
+      <w:r>
+        <w:t>This is the final step. No code changes are needed.</w:t>
+      </w:r>
+    </w:p>
+    <w:p>
+      <w:pPr>
+        <w:pStyle w:val="ListNumber"/>
+      </w:pPr>
+      <w:r>
+        <w:t>Go to share.streamlit.io</w:t>
+      </w:r>
+    </w:p>
+    <w:p>
+      <w:pPr>
+        <w:pStyle w:val="ListNumber"/>
+      </w:pPr>
+      <w:r>
+        <w:t>Find your app, click the three-dot menu &gt; Settings</w:t>
+      </w:r>
+    </w:p>
+    <w:p>
+      <w:pPr>
+        <w:pStyle w:val="ListNumber"/>
+      </w:pPr>
+      <w:r>
+        <w:t>Click the "Secrets" tab</w:t>
+      </w:r>
+    </w:p>
+    <w:p>
+      <w:pPr>
+        <w:pStyle w:val="ListNumber"/>
+      </w:pPr>
+      <w:r>
+        <w:t>Paste the following (with your actual values):</w:t>
+      </w:r>
+    </w:p>
+    <w:p>
+      <w:pPr>
+        <w:ind w:left="720"/>
+      </w:pPr>
+      <w:r>
+        <w:rPr>
+          <w:rFonts w:ascii="Consolas" w:hAnsi="Consolas"/>
+          <w:color w:val="2E2E38"/>
+          <w:sz w:val="20"/>
+        </w:rPr>
+        <w:t>[azure]</w:t>
+        <w:br/>
+        <w:t>client_id = "paste-your-application-client-id-here"</w:t>
+        <w:br/>
+        <w:t>client_secret = "paste-your-client-secret-value-here"</w:t>
+        <w:br/>
+        <w:t>tenant_id = "paste-your-directory-tenant-id-here"</w:t>
+        <w:br/>
+        <w:t>redirect_uri = "https://your-app-name.streamlit.app"</w:t>
+      </w:r>
+    </w:p>
+    <w:p>
+      <w:pPr>
+        <w:pStyle w:val="ListNumber"/>
+      </w:pPr>
+      <w:r>
+        <w:t>Click "Save"</w:t>
+      </w:r>
+    </w:p>
+    <w:p>
+      <w:pPr>
+        <w:pStyle w:val="ListNumber"/>
+      </w:pPr>
+      <w:r>
+        <w:t>Click "Reboot app"</w:t>
+      </w:r>
+    </w:p>
+    <w:p>
+      <w:pPr>
+        <w:pStyle w:val="Heading3"/>
+      </w:pPr>
+      <w:r>
+        <w:t>8f. Verify It Works</w:t>
+      </w:r>
+    </w:p>
+    <w:p>
+      <w:pPr>
+        <w:pStyle w:val="ListNumber"/>
+      </w:pPr>
+      <w:r>
+        <w:t>Open your dashboard URL in a private/incognito browser window</w:t>
+      </w:r>
+    </w:p>
+    <w:p>
+      <w:pPr>
+        <w:pStyle w:val="ListNumber"/>
+      </w:pPr>
+      <w:r>
+        <w:t>You should see a "Sign in with Microsoft" button</w:t>
+      </w:r>
+    </w:p>
+    <w:p>
+      <w:pPr>
+        <w:pStyle w:val="ListNumber"/>
+      </w:pPr>
+      <w:r>
+        <w:t>Click it — you will be redirected to Microsoft's login page</w:t>
+      </w:r>
+    </w:p>
+    <w:p>
+      <w:pPr>
+        <w:pStyle w:val="ListNumber"/>
+      </w:pPr>
+      <w:r>
+        <w:t>Sign in with your EY account</w:t>
+      </w:r>
+    </w:p>
+    <w:p>
+      <w:pPr>
+        <w:pStyle w:val="ListNumber"/>
+      </w:pPr>
+      <w:r>
+        <w:t>You should be returned to the dashboard showing your name and email</w:t>
+      </w:r>
+    </w:p>
+    <w:p>
+      <w:pPr>
+        <w:pStyle w:val="Heading3"/>
+      </w:pPr>
+      <w:r>
+        <w:t>What Changes for Users</w:t>
+      </w:r>
+    </w:p>
+    <w:p>
+      <w:pPr>
+        <w:pStyle w:val="ListBullet"/>
+      </w:pPr>
+      <w:r>
+        <w:t>Before SSO: Users type their email into a text box — no verification</w:t>
+      </w:r>
+    </w:p>
+    <w:p>
+      <w:pPr>
+        <w:pStyle w:val="ListBullet"/>
+      </w:pPr>
+      <w:r>
+        <w:t>After SSO: Users click 'Sign in with Microsoft' — Microsoft verifies their identity</w:t>
+      </w:r>
+    </w:p>
+    <w:p>
+      <w:pPr>
+        <w:pStyle w:val="ListBullet"/>
+      </w:pPr>
+      <w:r>
+        <w:t>After SSO: Only suitable for sensitive and confidential data</w:t>
+      </w:r>
+    </w:p>
+    <w:p>
+      <w:pPr>
+        <w:pStyle w:val="ListBullet"/>
+      </w:pPr>
+      <w:r>
+        <w:t>After SSO: Microsoft logs all sign-ins for audit purposes</w:t>
+      </w:r>
+    </w:p>
+    <w:p>
+      <w:pPr>
+        <w:pStyle w:val="Heading3"/>
+      </w:pPr>
+      <w:r>
+        <w:t>Email Template for Your IT Team</w:t>
+      </w:r>
+    </w:p>
+    <w:p>
+      <w:r>
+        <w:t>If you need to request help from IT, send them this:</w:t>
+        <w:br/>
+        <w:br/>
+        <w:t>"Hi, I need an Azure AD (Microsoft Entra ID) app registration for an internal Streamlit dashboard. Could you help with the following?</w:t>
+        <w:br/>
+        <w:t>1. Register a new app called Factory AI Dashboard</w:t>
+        <w:br/>
+        <w:t>2. Set supported account types to Accounts in this organizational directory only</w:t>
+        <w:br/>
+        <w:t>3. Add a Web redirect URI: [your Streamlit URL]</w:t>
+        <w:br/>
+        <w:t>4. Create a client secret</w:t>
+        <w:br/>
+        <w:t>5. Add the Microsoft Graph User.Read delegated permission and grant admin consent</w:t>
+        <w:br/>
+        <w:t>6. Send me the Application (client) ID, Directory (tenant) ID, and client secret value</w:t>
+        <w:br/>
+        <w:t>Thank you!"</w:t>
       </w:r>
     </w:p>
     <w:p>
@@ -930,6 +1411,72 @@
           <w:p>
             <w:r>
               <w:t>Sign up at streamlit.io/cloud with the same GitHub account that owns the repo.</w:t>
+            </w:r>
+          </w:p>
+        </w:tc>
+      </w:tr>
+      <w:tr>
+        <w:tc>
+          <w:tcPr>
+            <w:tcW w:type="dxa" w:w="4320"/>
+          </w:tcPr>
+          <w:p>
+            <w:r>
+              <w:t>SSO: "AADSTS50011" redirect URI error</w:t>
+            </w:r>
+          </w:p>
+        </w:tc>
+        <w:tc>
+          <w:tcPr>
+            <w:tcW w:type="dxa" w:w="4320"/>
+          </w:tcPr>
+          <w:p>
+            <w:r>
+              <w:t>The redirect URI in Azure does not match your Streamlit URL exactly. Fix it in Azure Portal &gt; App registration &gt; Authentication.</w:t>
+            </w:r>
+          </w:p>
+        </w:tc>
+      </w:tr>
+      <w:tr>
+        <w:tc>
+          <w:tcPr>
+            <w:tcW w:type="dxa" w:w="4320"/>
+          </w:tcPr>
+          <w:p>
+            <w:r>
+              <w:t>SSO: "Authentication failed"</w:t>
+            </w:r>
+          </w:p>
+        </w:tc>
+        <w:tc>
+          <w:tcPr>
+            <w:tcW w:type="dxa" w:w="4320"/>
+          </w:tcPr>
+          <w:p>
+            <w:r>
+              <w:t>The client secret may have expired. Create a new one in Azure Portal and update Streamlit Cloud secrets.</w:t>
+            </w:r>
+          </w:p>
+        </w:tc>
+      </w:tr>
+      <w:tr>
+        <w:tc>
+          <w:tcPr>
+            <w:tcW w:type="dxa" w:w="4320"/>
+          </w:tcPr>
+          <w:p>
+            <w:r>
+              <w:t>SSO: "Grant admin consent" button missing</w:t>
+            </w:r>
+          </w:p>
+        </w:tc>
+        <w:tc>
+          <w:tcPr>
+            <w:tcW w:type="dxa" w:w="4320"/>
+          </w:tcPr>
+          <w:p>
+            <w:r>
+              <w:t>You need a Global Administrator or Privileged Role Administrator to grant consent. Ask your IT admin.</w:t>
             </w:r>
           </w:p>
         </w:tc>

</xml_diff>

<commit_message>
Integrate SSO as core part of guide from the start, not optional add-on
Co-authored-by: factory-droid[bot] <138933559+factory-droid[bot]@users.noreply.github.com>
</commit_message>
<xml_diff>
--- a/Factory_AI_Dashboard_Guide.docx
+++ b/Factory_AI_Dashboard_Guide.docx
@@ -86,6 +86,14 @@
       </w:r>
     </w:p>
     <w:p>
+      <w:pPr>
+        <w:pStyle w:val="ListBullet"/>
+      </w:pPr>
+      <w:r>
+        <w:t>Is secured with Microsoft SSO — users sign in with their real EY account</w:t>
+      </w:r>
+    </w:p>
+    <w:p>
       <w:r>
         <w:rPr>
           <w:b/>
@@ -93,7 +101,7 @@
         <w:t xml:space="preserve">Time required: </w:t>
       </w:r>
       <w:r>
-        <w:t>~20 minutes</w:t>
+        <w:t>~30 minutes (including SSO setup)</w:t>
       </w:r>
     </w:p>
     <w:p>
@@ -242,7 +250,81 @@
           </w:p>
         </w:tc>
       </w:tr>
+      <w:tr>
+        <w:tc>
+          <w:tcPr>
+            <w:tcW w:type="dxa" w:w="4320"/>
+          </w:tcPr>
+          <w:p>
+            <w:r>
+              <w:t>Azure AD app registration (for SSO)</w:t>
+            </w:r>
+          </w:p>
+        </w:tc>
+        <w:tc>
+          <w:tcPr>
+            <w:tcW w:type="dxa" w:w="4320"/>
+          </w:tcPr>
+          <w:p>
+            <w:r>
+              <w:t>Request from your IT team — see Step 8 and email template below</w:t>
+            </w:r>
+          </w:p>
+        </w:tc>
+      </w:tr>
     </w:tbl>
+    <w:p/>
+    <w:p>
+      <w:r>
+        <w:rPr>
+          <w:b/>
+          <w:color w:val="E0004D"/>
+        </w:rPr>
+        <w:t xml:space="preserve">IMPORTANT: Send the Azure request now. </w:t>
+      </w:r>
+      <w:r>
+        <w:t>Step 8 requires your IT team to register an app in Azure, which may take a day or two. Send them the request now so it is ready by the time you reach Step 8. The dashboard works without SSO while you wait, but SSO is required before sharing sensitive data.</w:t>
+      </w:r>
+    </w:p>
+    <w:p>
+      <w:pPr>
+        <w:pStyle w:val="Heading2"/>
+      </w:pPr>
+      <w:r>
+        <w:t>Email Template — Send This to Your IT Team Now</w:t>
+      </w:r>
+    </w:p>
+    <w:p>
+      <w:pPr>
+        <w:ind w:left="720"/>
+      </w:pPr>
+      <w:r>
+        <w:rPr>
+          <w:i/>
+          <w:sz w:val="20"/>
+        </w:rPr>
+        <w:t>Hi,</w:t>
+        <w:br/>
+        <w:br/>
+        <w:t>I am building an internal Streamlit dashboard and need an Azure AD (Microsoft Entra ID) app registration to enable Microsoft SSO. Could you help with the following?</w:t>
+        <w:br/>
+        <w:br/>
+        <w:t>1. Register a new app called "Factory AI Dashboard"</w:t>
+        <w:br/>
+        <w:t>2. Set supported account types to "Accounts in this organizational directory only"</w:t>
+        <w:br/>
+        <w:t>3. Add a Web redirect URI (I will provide the URL once deployed — placeholder: https://placeholder.streamlit.app)</w:t>
+        <w:br/>
+        <w:t>4. Create a client secret</w:t>
+        <w:br/>
+        <w:t>5. Add the Microsoft Graph "User.Read" delegated permission and grant admin consent</w:t>
+        <w:br/>
+        <w:t>6. Send me the Application (client) ID, Directory (tenant) ID, and client secret value</w:t>
+        <w:br/>
+        <w:br/>
+        <w:t>Thank you!</w:t>
+      </w:r>
+    </w:p>
     <w:p>
       <w:pPr>
         <w:pStyle w:val="Heading1"/>
@@ -325,6 +407,12 @@
         <w:t>charts, and filters. Add role-based access so only admins can edit</w:t>
         <w:br/>
         <w:t>and everyone at EY with an @ey.com email can view.</w:t>
+        <w:br/>
+        <w:t>Include Microsoft SSO authentication using Azure AD so users</w:t>
+        <w:br/>
+        <w:t>sign in with their real EY Microsoft account. Fall back to</w:t>
+        <w:br/>
+        <w:t>manual email input if Azure secrets are not yet configured.</w:t>
       </w:r>
     </w:p>
     <w:p>
@@ -783,25 +871,25 @@
         <w:pStyle w:val="Heading1"/>
       </w:pPr>
       <w:r>
-        <w:t>Step 8: Secure Your Dashboard with Microsoft SSO</w:t>
-      </w:r>
-    </w:p>
-    <w:p>
-      <w:pPr>
-        <w:pStyle w:val="Heading3"/>
-      </w:pPr>
-      <w:r>
-        <w:t>Why This Matters</w:t>
+        <w:t>Step 8: Activate Microsoft SSO</w:t>
       </w:r>
     </w:p>
     <w:p>
       <w:r>
-        <w:t>Without SSO, anyone can type any @ey.com email into the dashboard. There is no way to verify they are who they say they are. If your dashboard contains sensitive or confidential data, you must enable Microsoft SSO.</w:t>
+        <w:t>Your dashboard already has SSO built in from Step 2. Now you activate it by pasting the three values your IT team provided (from the request you sent before starting).</w:t>
+      </w:r>
+    </w:p>
+    <w:p>
+      <w:pPr>
+        <w:pStyle w:val="Heading3"/>
+      </w:pPr>
+      <w:r>
+        <w:t>Why This Step Is Essential</w:t>
       </w:r>
     </w:p>
     <w:p>
       <w:r>
-        <w:t>SSO forces users to sign in with their real EY Microsoft account — the same login they use for Outlook and Teams.</w:t>
+        <w:t>Without SSO, anyone can type any @ey.com email into the dashboard with no verification. SSO forces users to sign in with their real EY Microsoft account — the same login they use for Outlook and Teams. This is required before sharing any sensitive data.</w:t>
       </w:r>
     </w:p>
     <w:p>
@@ -813,7 +901,7 @@
         <w:t xml:space="preserve">Tip: </w:t>
       </w:r>
       <w:r>
-        <w:t>The dashboard code already supports SSO. You do not need to change any code. You only need to register an app in Azure and paste three values into Streamlit Cloud. Once you do, SSO activates automatically.</w:t>
+        <w:t>No code changes needed. You are only pasting configuration values. The SSO code is already in your app.</w:t>
       </w:r>
     </w:p>
     <w:p>
@@ -826,7 +914,7 @@
     </w:p>
     <w:p>
       <w:r>
-        <w:t>You will need someone at EY with Azure AD admin (or Application Administrator) access. This is typically someone in your IT or Cloud Infrastructure team.</w:t>
+        <w:t>If your IT team has already responded to the email you sent at the start of this guide, you should have the three values (client_id, tenant_id, client_secret) ready to go. If not, follow the steps below or share this section with your IT contact.</w:t>
       </w:r>
     </w:p>
     <w:p>

</xml_diff>

<commit_message>
Add detailed admin vs viewer access management to all guides
Co-authored-by: factory-droid[bot] <138933559+factory-droid[bot]@users.noreply.github.com>
</commit_message>
<xml_diff>
--- a/Factory_AI_Dashboard_Guide.docx
+++ b/Factory_AI_Dashboard_Guide.docx
@@ -719,7 +719,7 @@
     </w:p>
     <w:p>
       <w:r>
-        <w:t>Your dashboard is now live. Share the Streamlit URL with anyone at EY.</w:t>
+        <w:t>Your dashboard is now live. Share the Streamlit URL with your team. For sensitive data, complete Step 8 (SSO) before sharing broadly.</w:t>
       </w:r>
     </w:p>
     <w:p>
@@ -727,7 +727,7 @@
         <w:pStyle w:val="Heading3"/>
       </w:pPr>
       <w:r>
-        <w:t>Access Model</w:t>
+        <w:t>Two Roles: Viewer vs Admin</w:t>
       </w:r>
     </w:p>
     <w:p>
@@ -735,7 +735,7 @@
         <w:pStyle w:val="ListBullet"/>
       </w:pPr>
       <w:r>
-        <w:t>Anyone with an @ey.com email: View the dashboard, use filters, explore data</w:t>
+        <w:t>Viewer (any @ey.com email): View charts, use filters, explore data</w:t>
       </w:r>
     </w:p>
     <w:p>
@@ -743,23 +743,28 @@
         <w:pStyle w:val="ListBullet"/>
       </w:pPr>
       <w:r>
-        <w:t>Admins (emails you configure): Edit data directly, download exports, manage other admins</w:t>
+        <w:t>Admin (only people you grant): Edit data, download CSV, save to Excel, manage other admins</w:t>
       </w:r>
     </w:p>
     <w:p>
-      <w:pPr>
-        <w:pStyle w:val="Heading3"/>
-      </w:pPr>
       <w:r>
-        <w:t>To add an admin:</w:t>
+        <w:t>You are the first admin. Your email is set as admin by default. Everyone else starts as a viewer.</w:t>
       </w:r>
     </w:p>
     <w:p>
       <w:pPr>
+        <w:pStyle w:val="Heading3"/>
+      </w:pPr>
+      <w:r>
+        <w:t>How to Give Someone Admin Access</w:t>
+      </w:r>
+    </w:p>
+    <w:p>
+      <w:pPr>
         <w:pStyle w:val="ListNumber"/>
       </w:pPr>
       <w:r>
-        <w:t>Open the dashboard and sign in with your @ey.com email</w:t>
+        <w:t>Open the dashboard and sign in (you must be an admin)</w:t>
       </w:r>
     </w:p>
     <w:p>
@@ -775,7 +780,7 @@
         <w:pStyle w:val="ListNumber"/>
       </w:pPr>
       <w:r>
-        <w:t>Enter the new admin's @ey.com email</w:t>
+        <w:t>Enter the person's full @ey.com email in the 'Add admin email' field</w:t>
       </w:r>
     </w:p>
     <w:p>
@@ -783,7 +788,75 @@
         <w:pStyle w:val="ListNumber"/>
       </w:pPr>
       <w:r>
-        <w:t>Click "Add Admin"</w:t>
+        <w:t>Click "Add Admin" — they have admin access immediately</w:t>
+      </w:r>
+    </w:p>
+    <w:p>
+      <w:pPr>
+        <w:pStyle w:val="Heading3"/>
+      </w:pPr>
+      <w:r>
+        <w:t>How to Remove Admin Access</w:t>
+      </w:r>
+    </w:p>
+    <w:p>
+      <w:pPr>
+        <w:pStyle w:val="ListNumber"/>
+      </w:pPr>
+      <w:r>
+        <w:t>Scroll to "Admin: Manage Admins"</w:t>
+      </w:r>
+    </w:p>
+    <w:p>
+      <w:pPr>
+        <w:pStyle w:val="ListNumber"/>
+      </w:pPr>
+      <w:r>
+        <w:t>Use the 'Remove admin' dropdown to select the person</w:t>
+      </w:r>
+    </w:p>
+    <w:p>
+      <w:pPr>
+        <w:pStyle w:val="ListNumber"/>
+      </w:pPr>
+      <w:r>
+        <w:t>Click "Remove Admin" — they revert to viewer immediately</w:t>
+      </w:r>
+    </w:p>
+    <w:p>
+      <w:r>
+        <w:rPr>
+          <w:b/>
+          <w:color w:val="00A3E0"/>
+        </w:rPr>
+        <w:t xml:space="preserve">Tip: </w:t>
+      </w:r>
+      <w:r>
+        <w:t>You cannot remove yourself as admin. There must always be at least one admin.</w:t>
+      </w:r>
+    </w:p>
+    <w:p>
+      <w:pPr>
+        <w:pStyle w:val="Heading3"/>
+      </w:pPr>
+      <w:r>
+        <w:t>What Each Role Sees</w:t>
+      </w:r>
+    </w:p>
+    <w:p>
+      <w:pPr>
+        <w:pStyle w:val="ListBullet"/>
+      </w:pPr>
+      <w:r>
+        <w:t>Viewers: Charts, KPIs, filters, read-only data table (in expandable section)</w:t>
+      </w:r>
+    </w:p>
+    <w:p>
+      <w:pPr>
+        <w:pStyle w:val="ListBullet"/>
+      </w:pPr>
+      <w:r>
+        <w:t>Admins: All of the above PLUS editable data table, save to Excel, CSV download, admin management panel</w:t>
       </w:r>
     </w:p>
     <w:p>

</xml_diff>

<commit_message>
Clarify in-app admin management in prompt and guides
Co-authored-by: factory-droid[bot] <138933559+factory-droid[bot]@users.noreply.github.com>
</commit_message>
<xml_diff>
--- a/Factory_AI_Dashboard_Guide.docx
+++ b/Factory_AI_Dashboard_Guide.docx
@@ -404,9 +404,11 @@
         <w:br/>
         <w:t>Use EY branding (dark theme, yellow accents). Include KPI cards,</w:t>
         <w:br/>
-        <w:t>charts, and filters. Add role-based access so only admins can edit</w:t>
+        <w:t>charts, and filters. Anyone with an @ey.com email can view.</w:t>
         <w:br/>
-        <w:t>and everyone at EY with an @ey.com email can view.</w:t>
+        <w:t>Only admins can edit data. Let me add and remove admins</w:t>
+        <w:br/>
+        <w:t>directly inside the app by entering their @ey.com email.</w:t>
         <w:br/>
         <w:t>Include Microsoft SSO authentication using Azure AD so users</w:t>
         <w:br/>

</xml_diff>